<commit_message>
Correct Potts expressive-property definitions in Table 3 after verification
- Independence: add Potts's 'largely' qualifier and one-way independence
- Descriptive ineffability: 'never fully satisfied paraphrasing' (per Potts 2007)
  rather than 'cannot paraphrase'; align body text in 6.3
- Confirms Davidson 17(3) and Potts 33(2) bibliographic details (already correct)

https://claude.ai/code/session_011aLbSQp45dQjyGbQrfjLUc
</commit_message>
<xml_diff>
--- a/Phatic-Only_Slang_6-7_JournalReview.docx
+++ b/Phatic-Only_Slang_6-7_JournalReview.docx
@@ -2427,7 +2427,7 @@
           <w:rFonts w:ascii="Times New Roman" w:hAnsi="Times New Roman"/>
           <w:sz w:val="22"/>
         </w:rPr>
-        <w:t xml:space="preserve"> with uncanny precision (Table 3); descriptive ineffability—speakers cannot paraphrase an expressive and instead resort to examples of use—is exactly the behaviour of teenagers and lexicographers confronted with </w:t>
+        <w:t xml:space="preserve"> with uncanny precision (Table 3); descriptive ineffability—speakers are never fully satisfied paraphrasing an expressive and resort instead to examples of use—is exactly the behaviour of teenagers and lexicographers confronted with </w:t>
       </w:r>
       <w:r>
         <w:rPr>
@@ -2557,7 +2557,22 @@
                 <w:rFonts w:ascii="Times New Roman" w:hAnsi="Times New Roman"/>
                 <w:sz w:val="19"/>
               </w:rPr>
-              <w:t>Expressive content is separate from at-issue/descriptive content</w:t>
+              <w:t xml:space="preserve">Expressive content is </w:t>
+            </w:r>
+            <w:r>
+              <w:rPr>
+                <w:rFonts w:ascii="Times New Roman" w:hAnsi="Times New Roman"/>
+                <w:i/>
+                <w:sz w:val="19"/>
+              </w:rPr>
+              <w:t>largely</w:t>
+            </w:r>
+            <w:r>
+              <w:rPr>
+                <w:rFonts w:ascii="Times New Roman" w:hAnsi="Times New Roman"/>
+                <w:sz w:val="19"/>
+              </w:rPr>
+              <w:t xml:space="preserve"> independent of—and does not affect—the at-issue/descriptive content</w:t>
             </w:r>
           </w:p>
         </w:tc>
@@ -2716,7 +2731,22 @@
                 <w:rFonts w:ascii="Times New Roman" w:hAnsi="Times New Roman"/>
                 <w:sz w:val="19"/>
               </w:rPr>
-              <w:t>Speakers cannot paraphrase it; they give examples of use</w:t>
+              <w:t xml:space="preserve">Speakers are never </w:t>
+            </w:r>
+            <w:r>
+              <w:rPr>
+                <w:rFonts w:ascii="Times New Roman" w:hAnsi="Times New Roman"/>
+                <w:i/>
+                <w:sz w:val="19"/>
+              </w:rPr>
+              <w:t>fully satisfied</w:t>
+            </w:r>
+            <w:r>
+              <w:rPr>
+                <w:rFonts w:ascii="Times New Roman" w:hAnsi="Times New Roman"/>
+                <w:sz w:val="19"/>
+              </w:rPr>
+              <w:t xml:space="preserve"> paraphrasing it in descriptive (non-expressive) terms</w:t>
             </w:r>
           </w:p>
         </w:tc>

</xml_diff>